<commit_message>
fix(analysis): update URLs for BAM and FASTA files for igv
</commit_message>
<xml_diff>
--- a/src/modules/report/templates/genetics_report_template.docx
+++ b/src/modules/report/templates/genetics_report_template.docx
@@ -222,6 +222,12 @@
               </w:rPr>
               <w:t>}</w:t>
             </w:r>
+            <w:r>
+              <w:rPr>
+                <w:sz w:val="19"/>
+              </w:rPr>
+              <w:t xml:space="preserve">                                                          </w:t>
+            </w:r>
           </w:p>
           <w:p>
             <w:pPr>
@@ -290,12 +296,19 @@
               </w:rPr>
               <w:t>}</w:t>
             </w:r>
+            <w:r>
+              <w:rPr>
+                <w:sz w:val="19"/>
+              </w:rPr>
+              <w:t xml:space="preserve">                                                  </w:t>
+            </w:r>
           </w:p>
           <w:p>
             <w:pPr>
               <w:pStyle w:val="TableParagraph"/>
               <w:spacing w:before="34" w:line="237" w:lineRule="auto"/>
               <w:ind w:left="124" w:right="2794"/>
+              <w:jc w:val="both"/>
               <w:rPr>
                 <w:sz w:val="19"/>
               </w:rPr>
@@ -1087,331 +1100,11 @@
     </w:p>
     <w:p>
       <w:pPr>
-        <w:pStyle w:val="BodyText"/>
-        <w:spacing w:before="26"/>
-        <w:rPr>
-          <w:b/>
-        </w:rPr>
-      </w:pPr>
-    </w:p>
-    <w:p>
-      <w:pPr>
         <w:spacing w:before="1"/>
-        <w:ind w:left="305"/>
         <w:rPr>
           <w:b/>
           <w:sz w:val="19"/>
-        </w:rPr>
-      </w:pPr>
-      <w:r>
-        <w:rPr>
-          <w:b/>
-          <w:color w:val="2B99C1"/>
-          <w:spacing w:val="-2"/>
-          <w:sz w:val="19"/>
-        </w:rPr>
-        <w:t>INTERPRETATION</w:t>
-      </w:r>
-    </w:p>
-    <w:p>
-      <w:pPr>
-        <w:pStyle w:val="BodyText"/>
-        <w:spacing w:before="5"/>
-        <w:rPr>
-          <w:b/>
-          <w:sz w:val="20"/>
-        </w:rPr>
-      </w:pPr>
-      <w:r>
-        <w:rPr>
-          <w:b/>
-          <w:noProof/>
-          <w:sz w:val="20"/>
-        </w:rPr>
-        <mc:AlternateContent>
-          <mc:Choice Requires="wps">
-            <w:drawing>
-              <wp:anchor distT="0" distB="0" distL="0" distR="0" simplePos="0" relativeHeight="487588352" behindDoc="1" locked="0" layoutInCell="1" allowOverlap="1" wp14:anchorId="7DFE43E4" wp14:editId="1E7F790B">
-                <wp:simplePos x="0" y="0"/>
-                <wp:positionH relativeFrom="page">
-                  <wp:posOffset>426719</wp:posOffset>
-                </wp:positionH>
-                <wp:positionV relativeFrom="paragraph">
-                  <wp:posOffset>168627</wp:posOffset>
-                </wp:positionV>
-                <wp:extent cx="6918959" cy="1501140"/>
-                <wp:effectExtent l="0" t="0" r="0" b="0"/>
-                <wp:wrapTopAndBottom/>
-                <wp:docPr id="10" name="Textbox 10"/>
-                <wp:cNvGraphicFramePr>
-                  <a:graphicFrameLocks xmlns:a="http://schemas.openxmlformats.org/drawingml/2006/main"/>
-                </wp:cNvGraphicFramePr>
-                <a:graphic xmlns:a="http://schemas.openxmlformats.org/drawingml/2006/main">
-                  <a:graphicData uri="http://schemas.microsoft.com/office/word/2010/wordprocessingShape">
-                    <wps:wsp>
-                      <wps:cNvSpPr txBox="1">
-                        <a:spLocks/>
-                      </wps:cNvSpPr>
-                      <wps:spPr>
-                        <a:xfrm>
-                          <a:off x="0" y="0"/>
-                          <a:ext cx="6918959" cy="1501140"/>
-                        </a:xfrm>
-                        <a:prstGeom prst="rect">
-                          <a:avLst/>
-                        </a:prstGeom>
-                        <a:ln w="7620">
-                          <a:solidFill>
-                            <a:srgbClr val="2B99C1"/>
-                          </a:solidFill>
-                          <a:prstDash val="solid"/>
-                        </a:ln>
-                      </wps:spPr>
-                      <wps:txbx>
-                        <w:txbxContent>
-                          <w:p>
-                            <w:pPr>
-                              <w:pStyle w:val="BodyText"/>
-                              <w:spacing w:before="87" w:line="237" w:lineRule="auto"/>
-                              <w:ind w:left="95" w:right="167"/>
-                            </w:pPr>
-                            <w:r>
-                              <w:t>By targeted cancer panel testing, a heterozygous uncertain significance variant NM_017891.</w:t>
-                            </w:r>
-                            <w:proofErr w:type="gramStart"/>
-                            <w:r>
-                              <w:t>5:c.</w:t>
-                            </w:r>
-                            <w:proofErr w:type="gramEnd"/>
-                            <w:r>
-                              <w:t>445+619G&gt;A () in the C1orf159 gene was identified.</w:t>
-                            </w:r>
-                          </w:p>
-                          <w:p>
-                            <w:pPr>
-                              <w:pStyle w:val="BodyText"/>
-                              <w:spacing w:line="237" w:lineRule="auto"/>
-                              <w:ind w:left="95" w:right="167"/>
-                            </w:pPr>
-                            <w:r>
-                              <w:t>By targeted cancer panel testing, a heterozygous uncertain significance variant NM_181809.</w:t>
-                            </w:r>
-                            <w:proofErr w:type="gramStart"/>
-                            <w:r>
-                              <w:t>4:c.</w:t>
-                            </w:r>
-                            <w:proofErr w:type="gramEnd"/>
-                            <w:r>
-                              <w:t>673+3181G&gt;T () in the BMP8A gene was identified.</w:t>
-                            </w:r>
-                          </w:p>
-                          <w:p>
-                            <w:pPr>
-                              <w:pStyle w:val="BodyText"/>
-                              <w:spacing w:line="237" w:lineRule="auto"/>
-                              <w:ind w:left="95" w:right="167"/>
-                            </w:pPr>
-                            <w:r>
-                              <w:t>By targeted cancer panel testing, a heterozygous uncertain significance variant NM_181809.</w:t>
-                            </w:r>
-                            <w:proofErr w:type="gramStart"/>
-                            <w:r>
-                              <w:t>4:c.</w:t>
-                            </w:r>
-                            <w:proofErr w:type="gramEnd"/>
-                            <w:r>
-                              <w:t>673+3093G&gt;T () in the BMP8A gene was identified.</w:t>
-                            </w:r>
-                          </w:p>
-                          <w:p>
-                            <w:pPr>
-                              <w:pStyle w:val="BodyText"/>
-                              <w:spacing w:line="237" w:lineRule="auto"/>
-                              <w:ind w:left="95" w:right="167"/>
-                            </w:pPr>
-                            <w:r>
-                              <w:t>By targeted cancer panel testing, a heterozygous pathogenic variant NM_002506.</w:t>
-                            </w:r>
-                            <w:proofErr w:type="gramStart"/>
-                            <w:r>
-                              <w:t>3:c.</w:t>
-                            </w:r>
-                            <w:proofErr w:type="gramEnd"/>
-                            <w:r>
-                              <w:t>191C&gt;T (NP_002497.</w:t>
-                            </w:r>
-                            <w:proofErr w:type="gramStart"/>
-                            <w:r>
-                              <w:t>2:p</w:t>
-                            </w:r>
-                            <w:proofErr w:type="gramEnd"/>
-                            <w:r>
-                              <w:t>.Ala64Val) in the NGF gene was identified.</w:t>
-                            </w:r>
-                          </w:p>
-                          <w:p>
-                            <w:pPr>
-                              <w:pStyle w:val="BodyText"/>
-                              <w:spacing w:line="237" w:lineRule="auto"/>
-                              <w:ind w:left="95" w:right="167"/>
-                            </w:pPr>
-                            <w:r>
-                              <w:t>By targeted cancer panel testing, a heterozygous pathogenic variant NM_001039876.</w:t>
-                            </w:r>
-                            <w:proofErr w:type="gramStart"/>
-                            <w:r>
-                              <w:t>3:c.</w:t>
-                            </w:r>
-                            <w:proofErr w:type="gramEnd"/>
-                            <w:r>
-                              <w:t>243T&gt;C (NP_001034965.</w:t>
-                            </w:r>
-                            <w:proofErr w:type="gramStart"/>
-                            <w:r>
-                              <w:t>1:p</w:t>
-                            </w:r>
-                            <w:proofErr w:type="gramEnd"/>
-                            <w:r>
-                              <w:t>.Ser81%3D) in the SYNE4 gene was identified.</w:t>
-                            </w:r>
-                          </w:p>
-                        </w:txbxContent>
-                      </wps:txbx>
-                      <wps:bodyPr wrap="square" lIns="0" tIns="0" rIns="0" bIns="0" rtlCol="0">
-                        <a:noAutofit/>
-                      </wps:bodyPr>
-                    </wps:wsp>
-                  </a:graphicData>
-                </a:graphic>
-              </wp:anchor>
-            </w:drawing>
-          </mc:Choice>
-          <mc:Fallback>
-            <w:pict>
-              <v:shape w14:anchorId="7DFE43E4" id="Textbox 10" o:spid="_x0000_s1027" type="#_x0000_t202" style="position:absolute;margin-left:33.6pt;margin-top:13.3pt;width:544.8pt;height:118.2pt;z-index:-15728128;visibility:visible;mso-wrap-style:square;mso-wrap-distance-left:0;mso-wrap-distance-top:0;mso-wrap-distance-right:0;mso-wrap-distance-bottom:0;mso-position-horizontal:absolute;mso-position-horizontal-relative:page;mso-position-vertical:absolute;mso-position-vertical-relative:text;v-text-anchor:top" o:gfxdata="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" filled="f" strokecolor="#2b99c1" strokeweight=".6pt">
-                <v:path arrowok="t"/>
-                <v:textbox inset="0,0,0,0">
-                  <w:txbxContent>
-                    <w:p>
-                      <w:pPr>
-                        <w:pStyle w:val="BodyText"/>
-                        <w:spacing w:before="87" w:line="237" w:lineRule="auto"/>
-                        <w:ind w:left="95" w:right="167"/>
-                      </w:pPr>
-                      <w:r>
-                        <w:t>By targeted cancer panel testing, a heterozygous uncertain significance variant NM_017891.</w:t>
-                      </w:r>
-                      <w:proofErr w:type="gramStart"/>
-                      <w:r>
-                        <w:t>5:c.</w:t>
-                      </w:r>
-                      <w:proofErr w:type="gramEnd"/>
-                      <w:r>
-                        <w:t>445+619G&gt;A () in the C1orf159 gene was identified.</w:t>
-                      </w:r>
-                    </w:p>
-                    <w:p>
-                      <w:pPr>
-                        <w:pStyle w:val="BodyText"/>
-                        <w:spacing w:line="237" w:lineRule="auto"/>
-                        <w:ind w:left="95" w:right="167"/>
-                      </w:pPr>
-                      <w:r>
-                        <w:t>By targeted cancer panel testing, a heterozygous uncertain significance variant NM_181809.</w:t>
-                      </w:r>
-                      <w:proofErr w:type="gramStart"/>
-                      <w:r>
-                        <w:t>4:c.</w:t>
-                      </w:r>
-                      <w:proofErr w:type="gramEnd"/>
-                      <w:r>
-                        <w:t>673+3181G&gt;T () in the BMP8A gene was identified.</w:t>
-                      </w:r>
-                    </w:p>
-                    <w:p>
-                      <w:pPr>
-                        <w:pStyle w:val="BodyText"/>
-                        <w:spacing w:line="237" w:lineRule="auto"/>
-                        <w:ind w:left="95" w:right="167"/>
-                      </w:pPr>
-                      <w:r>
-                        <w:t>By targeted cancer panel testing, a heterozygous uncertain significance variant NM_181809.</w:t>
-                      </w:r>
-                      <w:proofErr w:type="gramStart"/>
-                      <w:r>
-                        <w:t>4:c.</w:t>
-                      </w:r>
-                      <w:proofErr w:type="gramEnd"/>
-                      <w:r>
-                        <w:t>673+3093G&gt;T () in the BMP8A gene was identified.</w:t>
-                      </w:r>
-                    </w:p>
-                    <w:p>
-                      <w:pPr>
-                        <w:pStyle w:val="BodyText"/>
-                        <w:spacing w:line="237" w:lineRule="auto"/>
-                        <w:ind w:left="95" w:right="167"/>
-                      </w:pPr>
-                      <w:r>
-                        <w:t>By targeted cancer panel testing, a heterozygous pathogenic variant NM_002506.</w:t>
-                      </w:r>
-                      <w:proofErr w:type="gramStart"/>
-                      <w:r>
-                        <w:t>3:c.</w:t>
-                      </w:r>
-                      <w:proofErr w:type="gramEnd"/>
-                      <w:r>
-                        <w:t>191C&gt;T (NP_002497.</w:t>
-                      </w:r>
-                      <w:proofErr w:type="gramStart"/>
-                      <w:r>
-                        <w:t>2:p</w:t>
-                      </w:r>
-                      <w:proofErr w:type="gramEnd"/>
-                      <w:r>
-                        <w:t>.Ala64Val) in the NGF gene was identified.</w:t>
-                      </w:r>
-                    </w:p>
-                    <w:p>
-                      <w:pPr>
-                        <w:pStyle w:val="BodyText"/>
-                        <w:spacing w:line="237" w:lineRule="auto"/>
-                        <w:ind w:left="95" w:right="167"/>
-                      </w:pPr>
-                      <w:r>
-                        <w:t>By targeted cancer panel testing, a heterozygous pathogenic variant NM_001039876.</w:t>
-                      </w:r>
-                      <w:proofErr w:type="gramStart"/>
-                      <w:r>
-                        <w:t>3:c.</w:t>
-                      </w:r>
-                      <w:proofErr w:type="gramEnd"/>
-                      <w:r>
-                        <w:t>243T&gt;C (NP_001034965.</w:t>
-                      </w:r>
-                      <w:proofErr w:type="gramStart"/>
-                      <w:r>
-                        <w:t>1:p</w:t>
-                      </w:r>
-                      <w:proofErr w:type="gramEnd"/>
-                      <w:r>
-                        <w:t>.Ser81%3D) in the SYNE4 gene was identified.</w:t>
-                      </w:r>
-                    </w:p>
-                  </w:txbxContent>
-                </v:textbox>
-                <w10:wrap type="topAndBottom" anchorx="page"/>
-              </v:shape>
-            </w:pict>
-          </mc:Fallback>
-        </mc:AlternateContent>
-      </w:r>
-    </w:p>
-    <w:p>
-      <w:pPr>
-        <w:pStyle w:val="BodyText"/>
-        <w:rPr>
-          <w:b/>
+          <w:lang w:val="vi-VN"/>
         </w:rPr>
       </w:pPr>
     </w:p>
@@ -1541,10 +1234,11 @@
         <w:spacing w:line="237" w:lineRule="auto"/>
         <w:rPr>
           <w:sz w:val="19"/>
+          <w:lang w:val="vi-VN"/>
         </w:rPr>
         <w:sectPr>
-          <w:headerReference w:type="default" r:id="rId7"/>
-          <w:footerReference w:type="default" r:id="rId8"/>
+          <w:headerReference w:type="default" r:id="rId8"/>
+          <w:footerReference w:type="default" r:id="rId9"/>
           <w:type w:val="continuous"/>
           <w:pgSz w:w="12240" w:h="15840"/>
           <w:pgMar w:top="1320" w:right="360" w:bottom="1000" w:left="360" w:header="472" w:footer="800" w:gutter="0"/>
@@ -1631,7 +1325,7 @@
         <w:tc>
           <w:tcPr>
             <w:tcW w:w="1313" w:type="dxa"/>
-            <w:shd w:val="clear" w:color="auto" w:fill="F3F6F8"/>
+            <w:shd w:val="clear" w:color="auto" w:fill="2A99C1"/>
             <w:tcMar>
               <w:top w:w="105" w:type="dxa"/>
               <w:left w:w="110" w:type="dxa"/>
@@ -1643,11 +1337,15 @@
           <w:p>
             <w:pPr>
               <w:jc w:val="center"/>
+              <w:rPr>
+                <w:b/>
+                <w:color w:val="FFFFFF" w:themeColor="background1"/>
+              </w:rPr>
             </w:pPr>
             <w:r>
               <w:rPr>
                 <w:b/>
-                <w:color w:val="264653"/>
+                <w:color w:val="FFFFFF" w:themeColor="background1"/>
                 <w:sz w:val="21"/>
               </w:rPr>
               <w:t>GENE</w:t>
@@ -1657,7 +1355,7 @@
         <w:tc>
           <w:tcPr>
             <w:tcW w:w="2983" w:type="dxa"/>
-            <w:shd w:val="clear" w:color="auto" w:fill="F3F6F8"/>
+            <w:shd w:val="clear" w:color="auto" w:fill="2A99C1"/>
             <w:tcMar>
               <w:top w:w="105" w:type="dxa"/>
               <w:left w:w="110" w:type="dxa"/>
@@ -1669,21 +1367,26 @@
           <w:p>
             <w:pPr>
               <w:jc w:val="center"/>
+              <w:rPr>
+                <w:b/>
+                <w:color w:val="FFFFFF" w:themeColor="background1"/>
+                <w:lang w:val="vi-VN"/>
+              </w:rPr>
             </w:pPr>
             <w:r>
               <w:rPr>
                 <w:b/>
-                <w:color w:val="264653"/>
-                <w:sz w:val="21"/>
-              </w:rPr>
-              <w:t>VARIANT</w:t>
+                <w:color w:val="FFFFFF" w:themeColor="background1"/>
+                <w:lang w:val="vi-VN"/>
+              </w:rPr>
+              <w:t>CHANGES</w:t>
             </w:r>
           </w:p>
         </w:tc>
         <w:tc>
           <w:tcPr>
             <w:tcW w:w="1432" w:type="dxa"/>
-            <w:shd w:val="clear" w:color="auto" w:fill="F3F6F8"/>
+            <w:shd w:val="clear" w:color="auto" w:fill="2A99C1"/>
             <w:tcMar>
               <w:top w:w="105" w:type="dxa"/>
               <w:left w:w="110" w:type="dxa"/>
@@ -1695,11 +1398,15 @@
           <w:p>
             <w:pPr>
               <w:jc w:val="center"/>
+              <w:rPr>
+                <w:b/>
+                <w:color w:val="FFFFFF" w:themeColor="background1"/>
+              </w:rPr>
             </w:pPr>
             <w:r>
               <w:rPr>
                 <w:b/>
-                <w:color w:val="264653"/>
+                <w:color w:val="FFFFFF" w:themeColor="background1"/>
                 <w:sz w:val="21"/>
               </w:rPr>
               <w:t>ZYGOSITY</w:t>
@@ -1709,7 +1416,7 @@
         <w:tc>
           <w:tcPr>
             <w:tcW w:w="1730" w:type="dxa"/>
-            <w:shd w:val="clear" w:color="auto" w:fill="F3F6F8"/>
+            <w:shd w:val="clear" w:color="auto" w:fill="2A99C1"/>
             <w:tcMar>
               <w:top w:w="105" w:type="dxa"/>
               <w:left w:w="110" w:type="dxa"/>
@@ -1721,11 +1428,15 @@
           <w:p>
             <w:pPr>
               <w:jc w:val="center"/>
+              <w:rPr>
+                <w:b/>
+                <w:color w:val="FFFFFF" w:themeColor="background1"/>
+              </w:rPr>
             </w:pPr>
             <w:r>
               <w:rPr>
                 <w:b/>
-                <w:color w:val="264653"/>
+                <w:color w:val="FFFFFF" w:themeColor="background1"/>
                 <w:sz w:val="21"/>
               </w:rPr>
               <w:t>INHERITANCE</w:t>
@@ -1735,7 +1446,7 @@
         <w:tc>
           <w:tcPr>
             <w:tcW w:w="2804" w:type="dxa"/>
-            <w:shd w:val="clear" w:color="auto" w:fill="F3F6F8"/>
+            <w:shd w:val="clear" w:color="auto" w:fill="2A99C1"/>
             <w:tcMar>
               <w:top w:w="105" w:type="dxa"/>
               <w:left w:w="110" w:type="dxa"/>
@@ -1747,11 +1458,15 @@
           <w:p>
             <w:pPr>
               <w:jc w:val="center"/>
+              <w:rPr>
+                <w:b/>
+                <w:color w:val="FFFFFF" w:themeColor="background1"/>
+              </w:rPr>
             </w:pPr>
             <w:r>
               <w:rPr>
                 <w:b/>
-                <w:color w:val="264653"/>
+                <w:color w:val="FFFFFF" w:themeColor="background1"/>
                 <w:sz w:val="21"/>
               </w:rPr>
               <w:t>CLASSIFICATION</w:t>
@@ -1818,6 +1533,7 @@
           <w:p>
             <w:pPr>
               <w:spacing w:line="259" w:lineRule="auto"/>
+              <w:jc w:val="center"/>
             </w:pPr>
             <w:r>
               <w:t>{change}</w:t>
@@ -2068,6 +1784,9 @@
         <w:pStyle w:val="BodyText"/>
         <w:spacing w:line="237" w:lineRule="auto"/>
         <w:jc w:val="both"/>
+        <w:rPr>
+          <w:lang w:val="vi-VN"/>
+        </w:rPr>
         <w:sectPr>
           <w:pgSz w:w="12240" w:h="15840"/>
           <w:pgMar w:top="1320" w:right="360" w:bottom="1000" w:left="360" w:header="472" w:footer="800" w:gutter="0"/>
@@ -2478,7 +2197,6 @@
         </w:rPr>
         <w:t xml:space="preserve">  </w:t>
       </w:r>
-      <w:proofErr w:type="gramStart"/>
       <w:r>
         <w:t>12;</w:t>
       </w:r>
@@ -2498,15 +2216,7 @@
         <w:t xml:space="preserve">  </w:t>
       </w:r>
       <w:r>
-        <w:t>(</w:t>
-      </w:r>
-      <w:proofErr w:type="gramEnd"/>
-      <w:r>
-        <w:t>NM_007294.3</w:t>
-      </w:r>
-      <w:proofErr w:type="gramStart"/>
-      <w:r>
-        <w:t>)</w:t>
+        <w:t>(NM_007294.3)</w:t>
       </w:r>
       <w:r>
         <w:rPr>
@@ -2517,14 +2227,12 @@
       <w:r>
         <w:t>exon</w:t>
       </w:r>
-      <w:proofErr w:type="gramEnd"/>
       <w:r>
         <w:rPr>
           <w:spacing w:val="28"/>
         </w:rPr>
         <w:t xml:space="preserve">  </w:t>
       </w:r>
-      <w:proofErr w:type="gramStart"/>
       <w:r>
         <w:t>2;</w:t>
       </w:r>
@@ -2544,15 +2252,7 @@
         <w:t xml:space="preserve">  </w:t>
       </w:r>
       <w:r>
-        <w:t>(</w:t>
-      </w:r>
-      <w:proofErr w:type="gramEnd"/>
-      <w:r>
-        <w:t>NM_007194.4</w:t>
-      </w:r>
-      <w:proofErr w:type="gramStart"/>
-      <w:r>
-        <w:t>)</w:t>
+        <w:t>(NM_007194.4)</w:t>
       </w:r>
       <w:r>
         <w:rPr>
@@ -2563,7 +2263,6 @@
       <w:r>
         <w:t>exons</w:t>
       </w:r>
-      <w:proofErr w:type="gramEnd"/>
       <w:r>
         <w:rPr>
           <w:spacing w:val="29"/>
@@ -2571,11 +2270,7 @@
         <w:t xml:space="preserve">  </w:t>
       </w:r>
       <w:r>
-        <w:t>11-</w:t>
-      </w:r>
-      <w:proofErr w:type="gramStart"/>
-      <w:r>
-        <w:t>15;</w:t>
+        <w:t>11-15;</w:t>
       </w:r>
       <w:r>
         <w:rPr>
@@ -2587,14 +2282,7 @@
         <w:rPr>
           <w:spacing w:val="-4"/>
         </w:rPr>
-        <w:t>PMS</w:t>
-      </w:r>
-      <w:proofErr w:type="gramEnd"/>
-      <w:r>
-        <w:rPr>
-          <w:spacing w:val="-4"/>
-        </w:rPr>
-        <w:t>2</w:t>
+        <w:t>PMS2</w:t>
       </w:r>
     </w:p>
     <w:p>
@@ -3258,9 +2946,12 @@
         <w:pStyle w:val="BodyText"/>
         <w:spacing w:line="237" w:lineRule="auto"/>
         <w:jc w:val="both"/>
+        <w:rPr>
+          <w:lang w:val="vi-VN"/>
+        </w:rPr>
         <w:sectPr>
-          <w:headerReference w:type="default" r:id="rId9"/>
-          <w:footerReference w:type="default" r:id="rId10"/>
+          <w:headerReference w:type="default" r:id="rId10"/>
+          <w:footerReference w:type="default" r:id="rId11"/>
           <w:pgSz w:w="12240" w:h="15840"/>
           <w:pgMar w:top="1320" w:right="360" w:bottom="1000" w:left="360" w:header="472" w:footer="800" w:gutter="0"/>
           <w:cols w:space="720"/>
@@ -3365,7 +3056,7 @@
         </w:rPr>
         <w:t xml:space="preserve"> </w:t>
       </w:r>
-      <w:hyperlink r:id="rId11">
+      <w:hyperlink r:id="rId12">
         <w:r>
           <w:t>(info@btgenomics.com)</w:t>
         </w:r>
@@ -3492,7 +3183,7 @@
                 <w:color w:val="2B99C1"/>
                 <w:sz w:val="19"/>
               </w:rPr>
-              <w:t>ENLITER</w:t>
+              <w:t>GENETICS</w:t>
             </w:r>
             <w:r>
               <w:rPr>
@@ -4309,12 +4000,6 @@
       <w:pPr>
         <w:pStyle w:val="BodyText"/>
       </w:pPr>
-    </w:p>
-    <w:p>
-      <w:pPr>
-        <w:pStyle w:val="BodyText"/>
-        <w:spacing w:before="74"/>
-      </w:pPr>
       <w:r>
         <w:rPr>
           <w:b/>
@@ -4324,18 +4009,18 @@
         <mc:AlternateContent>
           <mc:Choice Requires="wps">
             <w:drawing>
-              <wp:anchor distT="0" distB="0" distL="0" distR="0" simplePos="0" relativeHeight="487591424" behindDoc="1" locked="0" layoutInCell="1" allowOverlap="1" wp14:anchorId="42945E23" wp14:editId="47608B2E">
+              <wp:anchor distT="0" distB="0" distL="0" distR="0" simplePos="0" relativeHeight="487599616" behindDoc="1" locked="0" layoutInCell="1" allowOverlap="1" wp14:anchorId="08E3E7F3" wp14:editId="0BEB0D77">
                 <wp:simplePos x="0" y="0"/>
                 <wp:positionH relativeFrom="page">
-                  <wp:posOffset>1011555</wp:posOffset>
+                  <wp:posOffset>4178300</wp:posOffset>
                 </wp:positionH>
                 <wp:positionV relativeFrom="paragraph">
-                  <wp:posOffset>194945</wp:posOffset>
+                  <wp:posOffset>898274</wp:posOffset>
                 </wp:positionV>
-                <wp:extent cx="2299970" cy="501015"/>
+                <wp:extent cx="2255520" cy="487045"/>
                 <wp:effectExtent l="0" t="0" r="0" b="0"/>
                 <wp:wrapTopAndBottom/>
-                <wp:docPr id="2014828025" name="Textbox 9"/>
+                <wp:docPr id="400130696" name="Textbox 9"/>
                 <wp:cNvGraphicFramePr>
                   <a:graphicFrameLocks xmlns:a="http://schemas.openxmlformats.org/drawingml/2006/main"/>
                 </wp:cNvGraphicFramePr>
@@ -4348,7 +4033,7 @@
                       <wps:spPr>
                         <a:xfrm>
                           <a:off x="0" y="0"/>
-                          <a:ext cx="2299970" cy="501015"/>
+                          <a:ext cx="2255520" cy="487045"/>
                         </a:xfrm>
                         <a:prstGeom prst="rect">
                           <a:avLst/>
@@ -4367,61 +4052,27 @@
                                 <w:ilvl w:val="0"/>
                                 <w:numId w:val="0"/>
                               </w:numPr>
-                              <w:spacing w:after="0" w:line="259" w:lineRule="auto"/>
+                              <w:spacing w:before="240" w:after="0" w:line="259" w:lineRule="auto"/>
                               <w:ind w:left="360" w:hanging="360"/>
                               <w:jc w:val="center"/>
                               <w:rPr>
-                                <w14:textOutline w14:w="9525" w14:cap="flat" w14:cmpd="sng" w14:algn="ctr">
-                                  <w14:solidFill>
-                                    <w14:schemeClr w14:val="bg1"/>
-                                  </w14:solidFill>
-                                  <w14:prstDash w14:val="solid"/>
-                                  <w14:round/>
-                                </w14:textOutline>
-                                <w14:textFill>
-                                  <w14:gradFill>
-                                    <w14:gsLst>
-                                      <w14:gs w14:pos="21000">
-                                        <w14:srgbClr w14:val="53575C"/>
-                                      </w14:gs>
-                                      <w14:gs w14:pos="88000">
-                                        <w14:srgbClr w14:val="C5C7CA"/>
-                                      </w14:gs>
-                                    </w14:gsLst>
-                                    <w14:lin w14:ang="5400000" w14:scaled="0"/>
-                                  </w14:gradFill>
-                                </w14:textFill>
+                                <w:sz w:val="24"/>
+                                <w:szCs w:val="24"/>
+                                <w:lang w:val="vi-VN"/>
                               </w:rPr>
                             </w:pPr>
                             <w:r>
                               <w:rPr>
-                                <w14:textOutline w14:w="9525" w14:cap="flat" w14:cmpd="sng" w14:algn="ctr">
-                                  <w14:solidFill>
-                                    <w14:schemeClr w14:val="bg1"/>
-                                  </w14:solidFill>
-                                  <w14:prstDash w14:val="solid"/>
-                                  <w14:round/>
-                                </w14:textOutline>
-                                <w14:textFill>
-                                  <w14:gradFill>
-                                    <w14:gsLst>
-                                      <w14:gs w14:pos="21000">
-                                        <w14:srgbClr w14:val="53575C"/>
-                                      </w14:gs>
-                                      <w14:gs w14:pos="88000">
-                                        <w14:srgbClr w14:val="C5C7CA"/>
-                                      </w14:gs>
-                                    </w14:gsLst>
-                                    <w14:lin w14:ang="5400000" w14:scaled="0"/>
-                                  </w14:gradFill>
-                                </w14:textFill>
+                                <w:sz w:val="24"/>
+                                <w:szCs w:val="24"/>
+                                <w:lang w:val="vi-VN"/>
                               </w:rPr>
-                              <w:t>Kien</w:t>
+                              <w:t>Date</w:t>
                             </w:r>
                           </w:p>
                         </w:txbxContent>
                       </wps:txbx>
-                      <wps:bodyPr wrap="square" lIns="0" tIns="0" rIns="0" bIns="0" rtlCol="0" anchor="ctr">
+                      <wps:bodyPr wrap="square" lIns="0" tIns="0" rIns="0" bIns="0" rtlCol="0">
                         <a:noAutofit/>
                       </wps:bodyPr>
                     </wps:wsp>
@@ -4438,7 +4089,11 @@
           </mc:Choice>
           <mc:Fallback>
             <w:pict>
-              <v:shape w14:anchorId="42945E23" id="_x0000_s1028" type="#_x0000_t202" style="position:absolute;margin-left:79.65pt;margin-top:15.35pt;width:181.1pt;height:39.45pt;z-index:-15725056;visibility:visible;mso-wrap-style:square;mso-width-percent:0;mso-height-percent:0;mso-wrap-distance-left:0;mso-wrap-distance-top:0;mso-wrap-distance-right:0;mso-wrap-distance-bottom:0;mso-position-horizontal:absolute;mso-position-horizontal-relative:page;mso-position-vertical:absolute;mso-position-vertical-relative:text;mso-width-percent:0;mso-height-percent:0;mso-width-relative:margin;mso-height-relative:margin;v-text-anchor:middle" o:gfxdata="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" filled="f" stroked="f" strokeweight=".6pt">
+              <v:shapetype w14:anchorId="08E3E7F3" id="_x0000_t202" coordsize="21600,21600" o:spt="202" path="m,l,21600r21600,l21600,xe">
+                <v:stroke joinstyle="miter"/>
+                <v:path gradientshapeok="t" o:connecttype="rect"/>
+              </v:shapetype>
+              <v:shape id="_x0000_s1027" type="#_x0000_t202" style="position:absolute;margin-left:329pt;margin-top:70.75pt;width:177.6pt;height:38.35pt;z-index:-15716864;visibility:visible;mso-wrap-style:square;mso-width-percent:0;mso-height-percent:0;mso-wrap-distance-left:0;mso-wrap-distance-top:0;mso-wrap-distance-right:0;mso-wrap-distance-bottom:0;mso-position-horizontal:absolute;mso-position-horizontal-relative:page;mso-position-vertical:absolute;mso-position-vertical-relative:text;mso-width-percent:0;mso-height-percent:0;mso-width-relative:margin;mso-height-relative:margin;v-text-anchor:top" o:gfxdata="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" filled="f" stroked="f" strokeweight=".6pt">
                 <v:textbox inset="0,0,0,0">
                   <w:txbxContent>
                     <w:p>
@@ -4448,56 +4103,22 @@
                           <w:ilvl w:val="0"/>
                           <w:numId w:val="0"/>
                         </w:numPr>
-                        <w:spacing w:after="0" w:line="259" w:lineRule="auto"/>
+                        <w:spacing w:before="240" w:after="0" w:line="259" w:lineRule="auto"/>
                         <w:ind w:left="360" w:hanging="360"/>
                         <w:jc w:val="center"/>
                         <w:rPr>
-                          <w14:textOutline w14:w="9525" w14:cap="flat" w14:cmpd="sng" w14:algn="ctr">
-                            <w14:solidFill>
-                              <w14:schemeClr w14:val="bg1"/>
-                            </w14:solidFill>
-                            <w14:prstDash w14:val="solid"/>
-                            <w14:round/>
-                          </w14:textOutline>
-                          <w14:textFill>
-                            <w14:gradFill>
-                              <w14:gsLst>
-                                <w14:gs w14:pos="21000">
-                                  <w14:srgbClr w14:val="53575C"/>
-                                </w14:gs>
-                                <w14:gs w14:pos="88000">
-                                  <w14:srgbClr w14:val="C5C7CA"/>
-                                </w14:gs>
-                              </w14:gsLst>
-                              <w14:lin w14:ang="5400000" w14:scaled="0"/>
-                            </w14:gradFill>
-                          </w14:textFill>
+                          <w:sz w:val="24"/>
+                          <w:szCs w:val="24"/>
+                          <w:lang w:val="vi-VN"/>
                         </w:rPr>
                       </w:pPr>
                       <w:r>
                         <w:rPr>
-                          <w14:textOutline w14:w="9525" w14:cap="flat" w14:cmpd="sng" w14:algn="ctr">
-                            <w14:solidFill>
-                              <w14:schemeClr w14:val="bg1"/>
-                            </w14:solidFill>
-                            <w14:prstDash w14:val="solid"/>
-                            <w14:round/>
-                          </w14:textOutline>
-                          <w14:textFill>
-                            <w14:gradFill>
-                              <w14:gsLst>
-                                <w14:gs w14:pos="21000">
-                                  <w14:srgbClr w14:val="53575C"/>
-                                </w14:gs>
-                                <w14:gs w14:pos="88000">
-                                  <w14:srgbClr w14:val="C5C7CA"/>
-                                </w14:gs>
-                              </w14:gsLst>
-                              <w14:lin w14:ang="5400000" w14:scaled="0"/>
-                            </w14:gradFill>
-                          </w14:textFill>
+                          <w:sz w:val="24"/>
+                          <w:szCs w:val="24"/>
+                          <w:lang w:val="vi-VN"/>
                         </w:rPr>
-                        <w:t>Kien</w:t>
+                        <w:t>Date</w:t>
                       </w:r>
                     </w:p>
                   </w:txbxContent>
@@ -4508,28 +4129,6 @@
           </mc:Fallback>
         </mc:AlternateContent>
       </w:r>
-    </w:p>
-    <w:p>
-      <w:pPr>
-        <w:pStyle w:val="BodyText"/>
-        <w:ind w:left="5460" w:right="1"/>
-        <w:jc w:val="center"/>
-      </w:pPr>
-      <w:r>
-        <w:rPr>
-          <w:spacing w:val="-2"/>
-        </w:rPr>
-        <w:t>23/01/2026</w:t>
-      </w:r>
-    </w:p>
-    <w:p>
-      <w:pPr>
-        <w:pStyle w:val="BodyText"/>
-        <w:spacing w:before="2"/>
-        <w:rPr>
-          <w:sz w:val="13"/>
-        </w:rPr>
-      </w:pPr>
       <w:r>
         <w:rPr>
           <w:b/>
@@ -4539,13 +4138,13 @@
         <mc:AlternateContent>
           <mc:Choice Requires="wps">
             <w:drawing>
-              <wp:anchor distT="0" distB="0" distL="0" distR="0" simplePos="0" relativeHeight="487593472" behindDoc="1" locked="0" layoutInCell="1" allowOverlap="1" wp14:anchorId="2EC6447E" wp14:editId="65402DF4">
+              <wp:anchor distT="0" distB="0" distL="0" distR="0" simplePos="0" relativeHeight="487593472" behindDoc="1" locked="0" layoutInCell="1" allowOverlap="1" wp14:anchorId="2EC6447E" wp14:editId="27A56AA9">
                 <wp:simplePos x="0" y="0"/>
                 <wp:positionH relativeFrom="page">
-                  <wp:posOffset>1056640</wp:posOffset>
+                  <wp:posOffset>1017905</wp:posOffset>
                 </wp:positionH>
                 <wp:positionV relativeFrom="paragraph">
-                  <wp:posOffset>335915</wp:posOffset>
+                  <wp:posOffset>899795</wp:posOffset>
                 </wp:positionV>
                 <wp:extent cx="2255520" cy="487045"/>
                 <wp:effectExtent l="0" t="0" r="0" b="0"/>
@@ -4582,12 +4181,20 @@
                                 <w:ilvl w:val="0"/>
                                 <w:numId w:val="0"/>
                               </w:numPr>
-                              <w:spacing w:after="0" w:line="259" w:lineRule="auto"/>
+                              <w:spacing w:before="240" w:after="0" w:line="259" w:lineRule="auto"/>
                               <w:ind w:left="360" w:hanging="360"/>
                               <w:jc w:val="center"/>
+                              <w:rPr>
+                                <w:sz w:val="24"/>
+                                <w:szCs w:val="24"/>
+                              </w:rPr>
                             </w:pPr>
                             <w:r>
-                              <w:t>Vo Van Kien</w:t>
+                              <w:rPr>
+                                <w:sz w:val="24"/>
+                                <w:szCs w:val="24"/>
+                              </w:rPr>
+                              <w:t>Genetics Service</w:t>
                             </w:r>
                           </w:p>
                         </w:txbxContent>
@@ -4609,7 +4216,11 @@
           </mc:Choice>
           <mc:Fallback>
             <w:pict>
-              <v:shape w14:anchorId="2EC6447E" id="_x0000_s1029" type="#_x0000_t202" style="position:absolute;margin-left:83.2pt;margin-top:26.45pt;width:177.6pt;height:38.35pt;z-index:-15723008;visibility:visible;mso-wrap-style:square;mso-width-percent:0;mso-height-percent:0;mso-wrap-distance-left:0;mso-wrap-distance-top:0;mso-wrap-distance-right:0;mso-wrap-distance-bottom:0;mso-position-horizontal:absolute;mso-position-horizontal-relative:page;mso-position-vertical:absolute;mso-position-vertical-relative:text;mso-width-percent:0;mso-height-percent:0;mso-width-relative:margin;mso-height-relative:margin;v-text-anchor:top" o:gfxdata="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" filled="f" stroked="f" strokeweight=".6pt">
+              <v:shapetype w14:anchorId="2EC6447E" id="_x0000_t202" coordsize="21600,21600" o:spt="202" path="m,l,21600r21600,l21600,xe">
+                <v:stroke joinstyle="miter"/>
+                <v:path gradientshapeok="t" o:connecttype="rect"/>
+              </v:shapetype>
+              <v:shape id="_x0000_s1028" type="#_x0000_t202" style="position:absolute;margin-left:80.15pt;margin-top:70.85pt;width:177.6pt;height:38.35pt;z-index:-15723008;visibility:visible;mso-wrap-style:square;mso-width-percent:0;mso-height-percent:0;mso-wrap-distance-left:0;mso-wrap-distance-top:0;mso-wrap-distance-right:0;mso-wrap-distance-bottom:0;mso-position-horizontal:absolute;mso-position-horizontal-relative:page;mso-position-vertical:absolute;mso-position-vertical-relative:text;mso-width-percent:0;mso-height-percent:0;mso-width-relative:margin;mso-height-relative:margin;v-text-anchor:top" o:gfxdata="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" filled="f" stroked="f" strokeweight=".6pt">
                 <v:textbox inset="0,0,0,0">
                   <w:txbxContent>
                     <w:p>
@@ -4619,12 +4230,20 @@
                           <w:ilvl w:val="0"/>
                           <w:numId w:val="0"/>
                         </w:numPr>
-                        <w:spacing w:after="0" w:line="259" w:lineRule="auto"/>
+                        <w:spacing w:before="240" w:after="0" w:line="259" w:lineRule="auto"/>
                         <w:ind w:left="360" w:hanging="360"/>
                         <w:jc w:val="center"/>
+                        <w:rPr>
+                          <w:sz w:val="24"/>
+                          <w:szCs w:val="24"/>
+                        </w:rPr>
                       </w:pPr>
                       <w:r>
-                        <w:t>Vo Van Kien</w:t>
+                        <w:rPr>
+                          <w:sz w:val="24"/>
+                          <w:szCs w:val="24"/>
+                        </w:rPr>
+                        <w:t>Genetics Service</w:t>
                       </w:r>
                     </w:p>
                   </w:txbxContent>
@@ -4643,13 +4262,157 @@
         <mc:AlternateContent>
           <mc:Choice Requires="wpg">
             <w:drawing>
-              <wp:anchor distT="0" distB="0" distL="0" distR="0" simplePos="0" relativeHeight="487588864" behindDoc="1" locked="0" layoutInCell="1" allowOverlap="1" wp14:anchorId="1B534E2D" wp14:editId="3AC7F7FA">
+              <wp:anchor distT="0" distB="0" distL="0" distR="0" simplePos="0" relativeHeight="487589376" behindDoc="1" locked="0" layoutInCell="1" allowOverlap="1" wp14:anchorId="7B59D750" wp14:editId="5D40D5DD">
                 <wp:simplePos x="0" y="0"/>
                 <wp:positionH relativeFrom="page">
-                  <wp:posOffset>461009</wp:posOffset>
+                  <wp:posOffset>3874134</wp:posOffset>
                 </wp:positionH>
                 <wp:positionV relativeFrom="paragraph">
-                  <wp:posOffset>111688</wp:posOffset>
+                  <wp:posOffset>766714</wp:posOffset>
+                </wp:positionV>
+                <wp:extent cx="3398520" cy="99060"/>
+                <wp:effectExtent l="0" t="0" r="0" b="0"/>
+                <wp:wrapTopAndBottom/>
+                <wp:docPr id="30" name="Group 30"/>
+                <wp:cNvGraphicFramePr>
+                  <a:graphicFrameLocks xmlns:a="http://schemas.openxmlformats.org/drawingml/2006/main"/>
+                </wp:cNvGraphicFramePr>
+                <a:graphic xmlns:a="http://schemas.openxmlformats.org/drawingml/2006/main">
+                  <a:graphicData uri="http://schemas.microsoft.com/office/word/2010/wordprocessingGroup">
+                    <wpg:wgp>
+                      <wpg:cNvGrpSpPr>
+                        <a:grpSpLocks/>
+                      </wpg:cNvGrpSpPr>
+                      <wpg:grpSpPr>
+                        <a:xfrm>
+                          <a:off x="0" y="0"/>
+                          <a:ext cx="3398520" cy="99060"/>
+                          <a:chOff x="0" y="0"/>
+                          <a:chExt cx="3398520" cy="99060"/>
+                        </a:xfrm>
+                      </wpg:grpSpPr>
+                      <pic:pic xmlns:pic="http://schemas.openxmlformats.org/drawingml/2006/picture">
+                        <pic:nvPicPr>
+                          <pic:cNvPr id="31" name="Image 31"/>
+                          <pic:cNvPicPr/>
+                        </pic:nvPicPr>
+                        <pic:blipFill>
+                          <a:blip r:embed="rId13" cstate="print"/>
+                          <a:stretch>
+                            <a:fillRect/>
+                          </a:stretch>
+                        </pic:blipFill>
+                        <pic:spPr>
+                          <a:xfrm>
+                            <a:off x="0" y="0"/>
+                            <a:ext cx="3398520" cy="99060"/>
+                          </a:xfrm>
+                          <a:prstGeom prst="rect">
+                            <a:avLst/>
+                          </a:prstGeom>
+                        </pic:spPr>
+                      </pic:pic>
+                      <wps:wsp>
+                        <wps:cNvPr id="32" name="Graphic 32"/>
+                        <wps:cNvSpPr/>
+                        <wps:spPr>
+                          <a:xfrm>
+                            <a:off x="38100" y="22861"/>
+                            <a:ext cx="3307079" cy="7620"/>
+                          </a:xfrm>
+                          <a:custGeom>
+                            <a:avLst/>
+                            <a:gdLst/>
+                            <a:ahLst/>
+                            <a:cxnLst/>
+                            <a:rect l="l" t="t" r="r" b="b"/>
+                            <a:pathLst>
+                              <a:path w="3307079" h="7620">
+                                <a:moveTo>
+                                  <a:pt x="3307080" y="7620"/>
+                                </a:moveTo>
+                                <a:lnTo>
+                                  <a:pt x="0" y="7620"/>
+                                </a:lnTo>
+                                <a:lnTo>
+                                  <a:pt x="0" y="0"/>
+                                </a:lnTo>
+                                <a:lnTo>
+                                  <a:pt x="3307080" y="0"/>
+                                </a:lnTo>
+                                <a:lnTo>
+                                  <a:pt x="3307080" y="7620"/>
+                                </a:lnTo>
+                                <a:close/>
+                              </a:path>
+                            </a:pathLst>
+                          </a:custGeom>
+                          <a:solidFill>
+                            <a:srgbClr val="101010"/>
+                          </a:solidFill>
+                        </wps:spPr>
+                        <wps:bodyPr wrap="square" lIns="0" tIns="0" rIns="0" bIns="0" rtlCol="0">
+                          <a:prstTxWarp prst="textNoShape">
+                            <a:avLst/>
+                          </a:prstTxWarp>
+                          <a:noAutofit/>
+                        </wps:bodyPr>
+                      </wps:wsp>
+                    </wpg:wgp>
+                  </a:graphicData>
+                </a:graphic>
+              </wp:anchor>
+            </w:drawing>
+          </mc:Choice>
+          <mc:Fallback>
+            <w:pict>
+              <v:group w14:anchorId="7A520FA5" id="Group 30" o:spid="_x0000_s1026" style="position:absolute;margin-left:305.05pt;margin-top:60.35pt;width:267.6pt;height:7.8pt;z-index:-15727104;mso-wrap-distance-left:0;mso-wrap-distance-right:0;mso-position-horizontal-relative:page" coordsize="33985,990" o:gfxdata="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">
+                <v:shapetype id="_x0000_t75" coordsize="21600,21600" o:spt="75" o:preferrelative="t" path="m@4@5l@4@11@9@11@9@5xe" filled="f" stroked="f">
+                  <v:stroke joinstyle="miter"/>
+                  <v:formulas>
+                    <v:f eqn="if lineDrawn pixelLineWidth 0"/>
+                    <v:f eqn="sum @0 1 0"/>
+                    <v:f eqn="sum 0 0 @1"/>
+                    <v:f eqn="prod @2 1 2"/>
+                    <v:f eqn="prod @3 21600 pixelWidth"/>
+                    <v:f eqn="prod @3 21600 pixelHeight"/>
+                    <v:f eqn="sum @0 0 1"/>
+                    <v:f eqn="prod @6 1 2"/>
+                    <v:f eqn="prod @7 21600 pixelWidth"/>
+                    <v:f eqn="sum @8 21600 0"/>
+                    <v:f eqn="prod @7 21600 pixelHeight"/>
+                    <v:f eqn="sum @10 21600 0"/>
+                  </v:formulas>
+                  <v:path o:extrusionok="f" gradientshapeok="t" o:connecttype="rect"/>
+                  <o:lock v:ext="edit" aspectratio="t"/>
+                </v:shapetype>
+                <v:shape id="Image 31" o:spid="_x0000_s1027" type="#_x0000_t75" style="position:absolute;width:33985;height:990;visibility:visible;mso-wrap-style:square" o:gfxdata="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">
+                  <v:imagedata r:id="rId14" o:title=""/>
+                </v:shape>
+                <v:shape id="Graphic 32" o:spid="_x0000_s1028" style="position:absolute;left:381;top:228;width:33070;height:76;visibility:visible;mso-wrap-style:square;v-text-anchor:top" coordsize="3307079,7620" o:gfxdata="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" path="m3307080,7620l,7620,,,3307080,r,7620xe" fillcolor="#101010" stroked="f">
+                  <v:path arrowok="t"/>
+                </v:shape>
+                <w10:wrap type="topAndBottom" anchorx="page"/>
+              </v:group>
+            </w:pict>
+          </mc:Fallback>
+        </mc:AlternateContent>
+      </w:r>
+      <w:r>
+        <w:rPr>
+          <w:noProof/>
+          <w:sz w:val="13"/>
+        </w:rPr>
+        <mc:AlternateContent>
+          <mc:Choice Requires="wpg">
+            <w:drawing>
+              <wp:anchor distT="0" distB="0" distL="0" distR="0" simplePos="0" relativeHeight="487588864" behindDoc="1" locked="0" layoutInCell="1" allowOverlap="1" wp14:anchorId="1B534E2D" wp14:editId="36E5FBB9">
+                <wp:simplePos x="0" y="0"/>
+                <wp:positionH relativeFrom="page">
+                  <wp:posOffset>418431</wp:posOffset>
+                </wp:positionH>
+                <wp:positionV relativeFrom="paragraph">
+                  <wp:posOffset>758930</wp:posOffset>
                 </wp:positionV>
                 <wp:extent cx="3406140" cy="99060"/>
                 <wp:effectExtent l="0" t="0" r="0" b="0"/>
@@ -4678,7 +4441,7 @@
                           <pic:cNvPicPr/>
                         </pic:nvPicPr>
                         <pic:blipFill>
-                          <a:blip r:embed="rId12" cstate="print"/>
+                          <a:blip r:embed="rId15" cstate="print"/>
                           <a:stretch>
                             <a:fillRect/>
                           </a:stretch>
@@ -4747,28 +4510,9 @@
           </mc:Choice>
           <mc:Fallback>
             <w:pict>
-              <v:group w14:anchorId="3C3BCBB8" id="Group 27" o:spid="_x0000_s1026" style="position:absolute;margin-left:36.3pt;margin-top:8.8pt;width:268.2pt;height:7.8pt;z-index:-15727616;mso-wrap-distance-left:0;mso-wrap-distance-right:0;mso-position-horizontal-relative:page" coordsize="34061,990" o:gfxdata="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">
-                <v:shapetype id="_x0000_t75" coordsize="21600,21600" o:spt="75" o:preferrelative="t" path="m@4@5l@4@11@9@11@9@5xe" filled="f" stroked="f">
-                  <v:stroke joinstyle="miter"/>
-                  <v:formulas>
-                    <v:f eqn="if lineDrawn pixelLineWidth 0"/>
-                    <v:f eqn="sum @0 1 0"/>
-                    <v:f eqn="sum 0 0 @1"/>
-                    <v:f eqn="prod @2 1 2"/>
-                    <v:f eqn="prod @3 21600 pixelWidth"/>
-                    <v:f eqn="prod @3 21600 pixelHeight"/>
-                    <v:f eqn="sum @0 0 1"/>
-                    <v:f eqn="prod @6 1 2"/>
-                    <v:f eqn="prod @7 21600 pixelWidth"/>
-                    <v:f eqn="sum @8 21600 0"/>
-                    <v:f eqn="prod @7 21600 pixelHeight"/>
-                    <v:f eqn="sum @10 21600 0"/>
-                  </v:formulas>
-                  <v:path o:extrusionok="f" gradientshapeok="t" o:connecttype="rect"/>
-                  <o:lock v:ext="edit" aspectratio="t"/>
-                </v:shapetype>
+              <v:group w14:anchorId="39952B10" id="Group 27" o:spid="_x0000_s1026" style="position:absolute;margin-left:32.95pt;margin-top:59.75pt;width:268.2pt;height:7.8pt;z-index:-15727616;mso-wrap-distance-left:0;mso-wrap-distance-right:0;mso-position-horizontal-relative:page" coordsize="34061,990" o:gfxdata="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">
                 <v:shape id="Image 28" o:spid="_x0000_s1027" type="#_x0000_t75" style="position:absolute;width:34061;height:990;visibility:visible;mso-wrap-style:square" o:gfxdata="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">
-                  <v:imagedata r:id="rId13" o:title=""/>
+                  <v:imagedata r:id="rId16" o:title=""/>
                 </v:shape>
                 <v:shape id="Graphic 29" o:spid="_x0000_s1028" style="position:absolute;left:381;top:228;width:33147;height:76;visibility:visible;mso-wrap-style:square;v-text-anchor:top" coordsize="3314700,7620" o:gfxdata="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" path="m3314700,7620l,7620,,,3314700,r,7620xe" fillcolor="#101010" stroked="f">
                   <v:path arrowok="t"/>
@@ -4781,148 +4525,276 @@
       </w:r>
       <w:r>
         <w:rPr>
+          <w:b/>
           <w:noProof/>
-          <w:sz w:val="13"/>
+          <w:sz w:val="20"/>
         </w:rPr>
         <mc:AlternateContent>
           <mc:Choice Requires="wps">
             <w:drawing>
-              <wp:anchor distT="0" distB="0" distL="0" distR="0" simplePos="0" relativeHeight="487589376" behindDoc="1" locked="0" layoutInCell="1" allowOverlap="1" wp14:anchorId="7B59D750" wp14:editId="40A60B27">
+              <wp:anchor distT="0" distB="0" distL="0" distR="0" simplePos="0" relativeHeight="487597568" behindDoc="1" locked="0" layoutInCell="1" allowOverlap="1" wp14:anchorId="6244AD04" wp14:editId="1C404140">
                 <wp:simplePos x="0" y="0"/>
                 <wp:positionH relativeFrom="page">
-                  <wp:posOffset>3928109</wp:posOffset>
+                  <wp:posOffset>4230149</wp:posOffset>
                 </wp:positionH>
                 <wp:positionV relativeFrom="paragraph">
-                  <wp:posOffset>111688</wp:posOffset>
+                  <wp:posOffset>277099</wp:posOffset>
                 </wp:positionV>
-                <wp:extent cx="3398520" cy="99060"/>
+                <wp:extent cx="2255520" cy="487045"/>
                 <wp:effectExtent l="0" t="0" r="0" b="0"/>
                 <wp:wrapTopAndBottom/>
-                <wp:docPr id="30" name="Group 30"/>
+                <wp:docPr id="2009554368" name="Textbox 9"/>
                 <wp:cNvGraphicFramePr>
                   <a:graphicFrameLocks xmlns:a="http://schemas.openxmlformats.org/drawingml/2006/main"/>
                 </wp:cNvGraphicFramePr>
                 <a:graphic xmlns:a="http://schemas.openxmlformats.org/drawingml/2006/main">
-                  <a:graphicData uri="http://schemas.microsoft.com/office/word/2010/wordprocessingGroup">
-                    <wpg:wgp>
-                      <wpg:cNvGrpSpPr>
-                        <a:grpSpLocks/>
-                      </wpg:cNvGrpSpPr>
-                      <wpg:grpSpPr>
+                  <a:graphicData uri="http://schemas.microsoft.com/office/word/2010/wordprocessingShape">
+                    <wps:wsp>
+                      <wps:cNvSpPr txBox="1">
+                        <a:spLocks/>
+                      </wps:cNvSpPr>
+                      <wps:spPr>
                         <a:xfrm>
                           <a:off x="0" y="0"/>
-                          <a:ext cx="3398520" cy="99060"/>
-                          <a:chOff x="0" y="0"/>
-                          <a:chExt cx="3398520" cy="99060"/>
+                          <a:ext cx="2255520" cy="487045"/>
                         </a:xfrm>
-                      </wpg:grpSpPr>
-                      <pic:pic xmlns:pic="http://schemas.openxmlformats.org/drawingml/2006/picture">
-                        <pic:nvPicPr>
-                          <pic:cNvPr id="31" name="Image 31"/>
-                          <pic:cNvPicPr/>
-                        </pic:nvPicPr>
-                        <pic:blipFill>
-                          <a:blip r:embed="rId14" cstate="print"/>
-                          <a:stretch>
-                            <a:fillRect/>
-                          </a:stretch>
-                        </pic:blipFill>
-                        <pic:spPr>
-                          <a:xfrm>
-                            <a:off x="0" y="0"/>
-                            <a:ext cx="3398520" cy="99060"/>
-                          </a:xfrm>
-                          <a:prstGeom prst="rect">
-                            <a:avLst/>
-                          </a:prstGeom>
-                        </pic:spPr>
-                      </pic:pic>
-                      <wps:wsp>
-                        <wps:cNvPr id="32" name="Graphic 32"/>
-                        <wps:cNvSpPr/>
-                        <wps:spPr>
-                          <a:xfrm>
-                            <a:off x="38100" y="22861"/>
-                            <a:ext cx="3307079" cy="7620"/>
-                          </a:xfrm>
-                          <a:custGeom>
-                            <a:avLst/>
-                            <a:gdLst/>
-                            <a:ahLst/>
-                            <a:cxnLst/>
-                            <a:rect l="l" t="t" r="r" b="b"/>
-                            <a:pathLst>
-                              <a:path w="3307079" h="7620">
-                                <a:moveTo>
-                                  <a:pt x="3307080" y="7620"/>
-                                </a:moveTo>
-                                <a:lnTo>
-                                  <a:pt x="0" y="7620"/>
-                                </a:lnTo>
-                                <a:lnTo>
-                                  <a:pt x="0" y="0"/>
-                                </a:lnTo>
-                                <a:lnTo>
-                                  <a:pt x="3307080" y="0"/>
-                                </a:lnTo>
-                                <a:lnTo>
-                                  <a:pt x="3307080" y="7620"/>
-                                </a:lnTo>
-                                <a:close/>
-                              </a:path>
-                            </a:pathLst>
-                          </a:custGeom>
-                          <a:solidFill>
-                            <a:srgbClr val="101010"/>
-                          </a:solidFill>
-                        </wps:spPr>
-                        <wps:bodyPr wrap="square" lIns="0" tIns="0" rIns="0" bIns="0" rtlCol="0">
-                          <a:prstTxWarp prst="textNoShape">
-                            <a:avLst/>
-                          </a:prstTxWarp>
-                          <a:noAutofit/>
-                        </wps:bodyPr>
-                      </wps:wsp>
-                    </wpg:wgp>
+                        <a:prstGeom prst="rect">
+                          <a:avLst/>
+                        </a:prstGeom>
+                        <a:ln w="7620">
+                          <a:noFill/>
+                          <a:prstDash val="solid"/>
+                        </a:ln>
+                      </wps:spPr>
+                      <wps:txbx>
+                        <w:txbxContent>
+                          <w:p>
+                            <w:pPr>
+                              <w:pStyle w:val="ListBullet"/>
+                              <w:numPr>
+                                <w:ilvl w:val="0"/>
+                                <w:numId w:val="0"/>
+                              </w:numPr>
+                              <w:spacing w:before="240" w:after="0" w:line="259" w:lineRule="auto"/>
+                              <w:ind w:left="360" w:hanging="360"/>
+                              <w:jc w:val="center"/>
+                              <w:rPr>
+                                <w:sz w:val="24"/>
+                                <w:szCs w:val="24"/>
+                              </w:rPr>
+                            </w:pPr>
+                            <w:r>
+                              <w:rPr>
+                                <w:spacing w:val="-2"/>
+                                <w:sz w:val="19"/>
+                              </w:rPr>
+                              <w:t>{</w:t>
+                            </w:r>
+                            <w:proofErr w:type="spellStart"/>
+                            <w:r>
+                              <w:rPr>
+                                <w:spacing w:val="-2"/>
+                                <w:sz w:val="19"/>
+                              </w:rPr>
+                              <w:t>report_date</w:t>
+                            </w:r>
+                            <w:proofErr w:type="spellEnd"/>
+                            <w:r>
+                              <w:rPr>
+                                <w:spacing w:val="-2"/>
+                                <w:sz w:val="19"/>
+                              </w:rPr>
+                              <w:t>}</w:t>
+                            </w:r>
+                          </w:p>
+                        </w:txbxContent>
+                      </wps:txbx>
+                      <wps:bodyPr wrap="square" lIns="0" tIns="0" rIns="0" bIns="0" rtlCol="0">
+                        <a:noAutofit/>
+                      </wps:bodyPr>
+                    </wps:wsp>
                   </a:graphicData>
                 </a:graphic>
+                <wp14:sizeRelH relativeFrom="margin">
+                  <wp14:pctWidth>0</wp14:pctWidth>
+                </wp14:sizeRelH>
+                <wp14:sizeRelV relativeFrom="margin">
+                  <wp14:pctHeight>0</wp14:pctHeight>
+                </wp14:sizeRelV>
               </wp:anchor>
             </w:drawing>
           </mc:Choice>
-          <mc:Fallback xmlns:pic="http://schemas.openxmlformats.org/drawingml/2006/picture" xmlns:a="http://schemas.openxmlformats.org/drawingml/2006/main" xmlns:ve="http://schemas.openxmlformats.org/markup-compatibility/2006">
+          <mc:Fallback>
             <w:pict>
-              <v:group style="position:absolute;margin-left:309.299988pt;margin-top:8.794336pt;width:267.6pt;height:7.8pt;mso-position-horizontal-relative:page;mso-position-vertical-relative:paragraph;z-index:-15727104;mso-wrap-distance-left:0;mso-wrap-distance-right:0" id="docshapegroup27" coordorigin="6186,176" coordsize="5352,156">
-                <v:shape style="position:absolute;left:6186;top:175;width:5352;height:156" type="#_x0000_t75" id="docshape28" stroked="false">
-                  <v:imagedata r:id="rId15" o:title=""/>
-                </v:shape>
-                <v:rect style="position:absolute;left:6246;top:211;width:5208;height:12" id="docshape29" filled="true" fillcolor="#101010" stroked="false">
-                  <v:fill type="solid"/>
-                </v:rect>
-                <w10:wrap type="topAndBottom"/>
-              </v:group>
+              <v:shape w14:anchorId="6244AD04" id="_x0000_s1029" type="#_x0000_t202" style="position:absolute;margin-left:333.1pt;margin-top:21.8pt;width:177.6pt;height:38.35pt;z-index:-15718912;visibility:visible;mso-wrap-style:square;mso-width-percent:0;mso-height-percent:0;mso-wrap-distance-left:0;mso-wrap-distance-top:0;mso-wrap-distance-right:0;mso-wrap-distance-bottom:0;mso-position-horizontal:absolute;mso-position-horizontal-relative:page;mso-position-vertical:absolute;mso-position-vertical-relative:text;mso-width-percent:0;mso-height-percent:0;mso-width-relative:margin;mso-height-relative:margin;v-text-anchor:top" o:gfxdata="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" filled="f" stroked="f" strokeweight=".6pt">
+                <v:textbox inset="0,0,0,0">
+                  <w:txbxContent>
+                    <w:p>
+                      <w:pPr>
+                        <w:pStyle w:val="ListBullet"/>
+                        <w:numPr>
+                          <w:ilvl w:val="0"/>
+                          <w:numId w:val="0"/>
+                        </w:numPr>
+                        <w:spacing w:before="240" w:after="0" w:line="259" w:lineRule="auto"/>
+                        <w:ind w:left="360" w:hanging="360"/>
+                        <w:jc w:val="center"/>
+                        <w:rPr>
+                          <w:sz w:val="24"/>
+                          <w:szCs w:val="24"/>
+                        </w:rPr>
+                      </w:pPr>
+                      <w:r>
+                        <w:rPr>
+                          <w:spacing w:val="-2"/>
+                          <w:sz w:val="19"/>
+                        </w:rPr>
+                        <w:t>{</w:t>
+                      </w:r>
+                      <w:proofErr w:type="spellStart"/>
+                      <w:r>
+                        <w:rPr>
+                          <w:spacing w:val="-2"/>
+                          <w:sz w:val="19"/>
+                        </w:rPr>
+                        <w:t>report_date</w:t>
+                      </w:r>
+                      <w:proofErr w:type="spellEnd"/>
+                      <w:r>
+                        <w:rPr>
+                          <w:spacing w:val="-2"/>
+                          <w:sz w:val="19"/>
+                        </w:rPr>
+                        <w:t>}</w:t>
+                      </w:r>
+                    </w:p>
+                  </w:txbxContent>
+                </v:textbox>
+                <w10:wrap type="topAndBottom" anchorx="page"/>
+              </v:shape>
             </w:pict>
           </mc:Fallback>
         </mc:AlternateContent>
       </w:r>
-    </w:p>
-    <w:p>
-      <w:pPr>
-        <w:pStyle w:val="BodyText"/>
-        <w:spacing w:before="169"/>
-        <w:ind w:left="5459" w:right="2"/>
-        <w:jc w:val="center"/>
-      </w:pPr>
-      <w:r>
-        <w:rPr>
-          <w:spacing w:val="-4"/>
-        </w:rPr>
-        <w:t>Date</w:t>
+      <w:r>
+        <w:rPr>
+          <w:b/>
+          <w:noProof/>
+          <w:sz w:val="20"/>
+        </w:rPr>
+        <mc:AlternateContent>
+          <mc:Choice Requires="wps">
+            <w:drawing>
+              <wp:anchor distT="0" distB="0" distL="0" distR="0" simplePos="0" relativeHeight="487591424" behindDoc="1" locked="0" layoutInCell="1" allowOverlap="1" wp14:anchorId="42945E23" wp14:editId="753E8883">
+                <wp:simplePos x="0" y="0"/>
+                <wp:positionH relativeFrom="page">
+                  <wp:posOffset>1008380</wp:posOffset>
+                </wp:positionH>
+                <wp:positionV relativeFrom="paragraph">
+                  <wp:posOffset>274955</wp:posOffset>
+                </wp:positionV>
+                <wp:extent cx="2268000" cy="432000"/>
+                <wp:effectExtent l="0" t="0" r="0" b="0"/>
+                <wp:wrapTopAndBottom/>
+                <wp:docPr id="2014828025" name="Textbox 9"/>
+                <wp:cNvGraphicFramePr>
+                  <a:graphicFrameLocks xmlns:a="http://schemas.openxmlformats.org/drawingml/2006/main"/>
+                </wp:cNvGraphicFramePr>
+                <a:graphic xmlns:a="http://schemas.openxmlformats.org/drawingml/2006/main">
+                  <a:graphicData uri="http://schemas.microsoft.com/office/word/2010/wordprocessingShape">
+                    <wps:wsp>
+                      <wps:cNvSpPr txBox="1">
+                        <a:spLocks/>
+                      </wps:cNvSpPr>
+                      <wps:spPr>
+                        <a:xfrm>
+                          <a:off x="0" y="0"/>
+                          <a:ext cx="2268000" cy="432000"/>
+                        </a:xfrm>
+                        <a:prstGeom prst="rect">
+                          <a:avLst/>
+                        </a:prstGeom>
+                        <a:ln w="7620">
+                          <a:noFill/>
+                          <a:prstDash val="solid"/>
+                        </a:ln>
+                      </wps:spPr>
+                      <wps:txbx>
+                        <w:txbxContent>
+                          <w:p>
+                            <w:pPr>
+                              <w:jc w:val="center"/>
+                              <w:rPr>
+                                <w:rFonts w:ascii="Edwardian Script ITC" w:eastAsia="Brush Script MT" w:hAnsi="Edwardian Script ITC" w:cs="Brush Script MT"/>
+                                <w:sz w:val="56"/>
+                                <w:szCs w:val="56"/>
+                              </w:rPr>
+                            </w:pPr>
+                            <w:r>
+                              <w:rPr>
+                                <w:rFonts w:ascii="Edwardian Script ITC" w:eastAsia="Brush Script MT" w:hAnsi="Edwardian Script ITC" w:cs="Brush Script MT"/>
+                                <w:sz w:val="56"/>
+                                <w:szCs w:val="56"/>
+                              </w:rPr>
+                              <w:t>Genetics</w:t>
+                            </w:r>
+                          </w:p>
+                        </w:txbxContent>
+                      </wps:txbx>
+                      <wps:bodyPr wrap="square" lIns="0" tIns="0" rIns="0" bIns="0" rtlCol="0" anchor="ctr">
+                        <a:noAutofit/>
+                      </wps:bodyPr>
+                    </wps:wsp>
+                  </a:graphicData>
+                </a:graphic>
+                <wp14:sizeRelH relativeFrom="margin">
+                  <wp14:pctWidth>0</wp14:pctWidth>
+                </wp14:sizeRelH>
+                <wp14:sizeRelV relativeFrom="margin">
+                  <wp14:pctHeight>0</wp14:pctHeight>
+                </wp14:sizeRelV>
+              </wp:anchor>
+            </w:drawing>
+          </mc:Choice>
+          <mc:Fallback>
+            <w:pict>
+              <v:shape w14:anchorId="42945E23" id="_x0000_s1030" type="#_x0000_t202" style="position:absolute;margin-left:79.4pt;margin-top:21.65pt;width:178.6pt;height:34pt;z-index:-15725056;visibility:visible;mso-wrap-style:square;mso-width-percent:0;mso-height-percent:0;mso-wrap-distance-left:0;mso-wrap-distance-top:0;mso-wrap-distance-right:0;mso-wrap-distance-bottom:0;mso-position-horizontal:absolute;mso-position-horizontal-relative:page;mso-position-vertical:absolute;mso-position-vertical-relative:text;mso-width-percent:0;mso-height-percent:0;mso-width-relative:margin;mso-height-relative:margin;v-text-anchor:middle" o:gfxdata="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" filled="f" stroked="f" strokeweight=".6pt">
+                <v:textbox inset="0,0,0,0">
+                  <w:txbxContent>
+                    <w:p>
+                      <w:pPr>
+                        <w:jc w:val="center"/>
+                        <w:rPr>
+                          <w:rFonts w:ascii="Edwardian Script ITC" w:eastAsia="Brush Script MT" w:hAnsi="Edwardian Script ITC" w:cs="Brush Script MT"/>
+                          <w:sz w:val="56"/>
+                          <w:szCs w:val="56"/>
+                        </w:rPr>
+                      </w:pPr>
+                      <w:r>
+                        <w:rPr>
+                          <w:rFonts w:ascii="Edwardian Script ITC" w:eastAsia="Brush Script MT" w:hAnsi="Edwardian Script ITC" w:cs="Brush Script MT"/>
+                          <w:sz w:val="56"/>
+                          <w:szCs w:val="56"/>
+                        </w:rPr>
+                        <w:t>Genetics</w:t>
+                      </w:r>
+                    </w:p>
+                  </w:txbxContent>
+                </v:textbox>
+                <w10:wrap type="topAndBottom" anchorx="page"/>
+              </v:shape>
+            </w:pict>
+          </mc:Fallback>
+        </mc:AlternateContent>
       </w:r>
     </w:p>
     <w:p>
       <w:pPr>
         <w:pStyle w:val="BodyText"/>
         <w:spacing w:before="197"/>
+        <w:rPr>
+          <w:lang w:val="vi-VN"/>
+        </w:rPr>
       </w:pPr>
     </w:p>
     <w:p>
@@ -5049,8 +4921,8 @@
       </w:r>
     </w:p>
     <w:sectPr>
-      <w:headerReference w:type="default" r:id="rId16"/>
-      <w:footerReference w:type="default" r:id="rId17"/>
+      <w:headerReference w:type="default" r:id="rId17"/>
+      <w:footerReference w:type="default" r:id="rId18"/>
       <w:pgSz w:w="12240" w:h="15840"/>
       <w:pgMar w:top="1320" w:right="360" w:bottom="1000" w:left="360" w:header="472" w:footer="800" w:gutter="0"/>
       <w:cols w:space="720"/>
@@ -6289,7 +6161,7 @@
         <wp:inline distT="0" distB="0" distL="0" distR="0" wp14:anchorId="6AB51C09" wp14:editId="4762B176">
           <wp:extent cx="1978701" cy="630555"/>
           <wp:effectExtent l="0" t="0" r="0" b="0"/>
-          <wp:docPr id="1630489558" name="Picture 28" descr="A blue and black logo&#10;&#10;AI-generated content may be incorrect."/>
+          <wp:docPr id="1168615568" name="Picture 28" descr="A blue and black logo&#10;&#10;AI-generated content may be incorrect."/>
           <wp:cNvGraphicFramePr>
             <a:graphicFrameLocks xmlns:a="http://schemas.openxmlformats.org/drawingml/2006/main" noChangeAspect="1"/>
           </wp:cNvGraphicFramePr>
@@ -6864,7 +6736,7 @@
         <wp:inline distT="0" distB="0" distL="0" distR="0" wp14:anchorId="54C915AD" wp14:editId="3CEF8CD3">
           <wp:extent cx="1978701" cy="630555"/>
           <wp:effectExtent l="0" t="0" r="0" b="0"/>
-          <wp:docPr id="963915890" name="Picture 28" descr="A blue and black logo&#10;&#10;AI-generated content may be incorrect."/>
+          <wp:docPr id="1914852854" name="Picture 28" descr="A blue and black logo&#10;&#10;AI-generated content may be incorrect."/>
           <wp:cNvGraphicFramePr>
             <a:graphicFrameLocks xmlns:a="http://schemas.openxmlformats.org/drawingml/2006/main" noChangeAspect="1"/>
           </wp:cNvGraphicFramePr>
@@ -8609,4 +8481,16 @@
   <a:objectDefaults/>
   <a:extraClrSchemeLst/>
 </a:theme>
+</file>
+
+<file path=customXml/item1.xml><?xml version="1.0" encoding="utf-8"?>
+<b:Sources xmlns:b="http://schemas.openxmlformats.org/officeDocument/2006/bibliography" xmlns="http://schemas.openxmlformats.org/officeDocument/2006/bibliography" SelectedStyle="/APASixthEditionOfficeOnline.xsl" StyleName="APA" Version="6"/>
+</file>
+
+<file path=customXml/itemProps1.xml><?xml version="1.0" encoding="utf-8"?>
+<ds:datastoreItem xmlns:ds="http://schemas.openxmlformats.org/officeDocument/2006/customXml" ds:itemID="{A5F9C6B9-AEC9-1A43-97B7-0DBE29E529BF}">
+  <ds:schemaRefs>
+    <ds:schemaRef ds:uri="http://schemas.openxmlformats.org/officeDocument/2006/bibliography"/>
+  </ds:schemaRefs>
+</ds:datastoreItem>
 </file>
</xml_diff>

<commit_message>
feat(report): build variant summary and search references for report
</commit_message>
<xml_diff>
--- a/src/modules/report/templates/genetics_report_template.docx
+++ b/src/modules/report/templates/genetics_report_template.docx
@@ -1741,11 +1741,23 @@
         </w:numPr>
         <w:spacing w:after="0" w:line="259" w:lineRule="auto"/>
         <w:ind w:left="360" w:hanging="360"/>
+        <w:rPr>
+          <w:sz w:val="19"/>
+          <w:szCs w:val="19"/>
+        </w:rPr>
       </w:pPr>
       <w:r>
+        <w:rPr>
+          <w:sz w:val="19"/>
+          <w:szCs w:val="19"/>
+        </w:rPr>
         <w:t xml:space="preserve">      </w:t>
       </w:r>
       <w:r>
+        <w:rPr>
+          <w:sz w:val="19"/>
+          <w:szCs w:val="19"/>
+        </w:rPr>
         <w:t>{#details}</w:t>
       </w:r>
     </w:p>
@@ -1758,8 +1770,16 @@
         </w:numPr>
         <w:spacing w:after="0" w:line="259" w:lineRule="auto"/>
         <w:ind w:left="360" w:hanging="360"/>
+        <w:rPr>
+          <w:sz w:val="19"/>
+          <w:szCs w:val="19"/>
+        </w:rPr>
       </w:pPr>
       <w:r>
+        <w:rPr>
+          <w:sz w:val="19"/>
+          <w:szCs w:val="19"/>
+        </w:rPr>
         <w:t xml:space="preserve">       {text}</w:t>
       </w:r>
     </w:p>
@@ -1868,7 +1888,13 @@
         <w:t xml:space="preserve"> </w:t>
       </w:r>
       <w:r>
-        <w:t>lab (#), followed by bioinformatic analysis and clinical reporting performed at Breakthrough Genomics.</w:t>
+        <w:t xml:space="preserve">lab (#), followed by bioinformatic analysis and clinical reporting performed at </w:t>
+      </w:r>
+      <w:r>
+        <w:t>Genetics</w:t>
+      </w:r>
+      <w:r>
+        <w:t>.</w:t>
       </w:r>
       <w:r>
         <w:rPr>
@@ -2647,7 +2673,13 @@
         <w:jc w:val="both"/>
       </w:pPr>
       <w:r>
-        <w:t>This test was developed and its performance validated by Breakthrough Genomics. The US Food and Drug Administration (FDA) has determined that clearance or approval of this method is not necessary and thus neither have been obtained. This test has been</w:t>
+        <w:t xml:space="preserve">This test was developed and its performance validated by </w:t>
+      </w:r>
+      <w:r>
+        <w:t>Genetics</w:t>
+      </w:r>
+      <w:r>
+        <w:t>. The US Food and Drug Administration (FDA) has determined that clearance or approval of this method is not necessary and thus neither have been obtained. This test has been</w:t>
       </w:r>
       <w:r>
         <w:rPr>
@@ -3039,7 +3071,7 @@
         <w:t xml:space="preserve"> </w:t>
       </w:r>
       <w:r>
-        <w:t>Breakthrough</w:t>
+        <w:t>Genetics</w:t>
       </w:r>
       <w:r>
         <w:rPr>
@@ -3047,18 +3079,12 @@
         </w:rPr>
         <w:t xml:space="preserve"> </w:t>
       </w:r>
-      <w:r>
-        <w:t>Genomics</w:t>
-      </w:r>
-      <w:r>
-        <w:rPr>
-          <w:spacing w:val="30"/>
-        </w:rPr>
-        <w:t xml:space="preserve"> </w:t>
-      </w:r>
-      <w:hyperlink r:id="rId12">
+      <w:hyperlink r:id="rId12" w:history="1">
         <w:r>
-          <w:t>(info@btgenomics.com)</w:t>
+          <w:rPr>
+            <w:rStyle w:val="Hyperlink"/>
+          </w:rPr>
+          <w:t>(info@genetics.com)</w:t>
         </w:r>
       </w:hyperlink>
       <w:r>
@@ -4802,114 +4828,11 @@
         <w:ind w:left="305"/>
         <w:rPr>
           <w:b/>
+          <w:color w:val="2B99C1"/>
+          <w:spacing w:val="-2"/>
           <w:sz w:val="19"/>
         </w:rPr>
       </w:pPr>
-      <w:r>
-        <w:rPr>
-          <w:b/>
-          <w:noProof/>
-          <w:sz w:val="20"/>
-        </w:rPr>
-        <mc:AlternateContent>
-          <mc:Choice Requires="wps">
-            <w:drawing>
-              <wp:anchor distT="0" distB="0" distL="0" distR="0" simplePos="0" relativeHeight="487595520" behindDoc="1" locked="0" layoutInCell="1" allowOverlap="1" wp14:anchorId="5B8E4777" wp14:editId="39399386">
-                <wp:simplePos x="0" y="0"/>
-                <wp:positionH relativeFrom="page">
-                  <wp:posOffset>292308</wp:posOffset>
-                </wp:positionH>
-                <wp:positionV relativeFrom="paragraph">
-                  <wp:posOffset>329378</wp:posOffset>
-                </wp:positionV>
-                <wp:extent cx="1228725" cy="487045"/>
-                <wp:effectExtent l="0" t="0" r="0" b="0"/>
-                <wp:wrapTopAndBottom/>
-                <wp:docPr id="49593884" name="Textbox 9"/>
-                <wp:cNvGraphicFramePr>
-                  <a:graphicFrameLocks xmlns:a="http://schemas.openxmlformats.org/drawingml/2006/main"/>
-                </wp:cNvGraphicFramePr>
-                <a:graphic xmlns:a="http://schemas.openxmlformats.org/drawingml/2006/main">
-                  <a:graphicData uri="http://schemas.microsoft.com/office/word/2010/wordprocessingShape">
-                    <wps:wsp>
-                      <wps:cNvSpPr txBox="1">
-                        <a:spLocks/>
-                      </wps:cNvSpPr>
-                      <wps:spPr>
-                        <a:xfrm>
-                          <a:off x="0" y="0"/>
-                          <a:ext cx="1228725" cy="487045"/>
-                        </a:xfrm>
-                        <a:prstGeom prst="rect">
-                          <a:avLst/>
-                        </a:prstGeom>
-                        <a:ln w="7620">
-                          <a:noFill/>
-                          <a:prstDash val="solid"/>
-                        </a:ln>
-                      </wps:spPr>
-                      <wps:txbx>
-                        <w:txbxContent>
-                          <w:p>
-                            <w:pPr>
-                              <w:pStyle w:val="ListBullet"/>
-                              <w:numPr>
-                                <w:ilvl w:val="0"/>
-                                <w:numId w:val="0"/>
-                              </w:numPr>
-                              <w:spacing w:after="0" w:line="259" w:lineRule="auto"/>
-                              <w:ind w:left="360" w:hanging="360"/>
-                              <w:jc w:val="center"/>
-                            </w:pPr>
-                            <w:r>
-                              <w:t>Na</w:t>
-                            </w:r>
-                          </w:p>
-                        </w:txbxContent>
-                      </wps:txbx>
-                      <wps:bodyPr wrap="square" lIns="0" tIns="0" rIns="0" bIns="0" rtlCol="0">
-                        <a:noAutofit/>
-                      </wps:bodyPr>
-                    </wps:wsp>
-                  </a:graphicData>
-                </a:graphic>
-                <wp14:sizeRelH relativeFrom="margin">
-                  <wp14:pctWidth>0</wp14:pctWidth>
-                </wp14:sizeRelH>
-                <wp14:sizeRelV relativeFrom="margin">
-                  <wp14:pctHeight>0</wp14:pctHeight>
-                </wp14:sizeRelV>
-              </wp:anchor>
-            </w:drawing>
-          </mc:Choice>
-          <mc:Fallback>
-            <w:pict>
-              <v:shape w14:anchorId="5B8E4777" id="_x0000_s1030" type="#_x0000_t202" style="position:absolute;left:0;text-align:left;margin-left:23pt;margin-top:25.95pt;width:96.75pt;height:38.35pt;z-index:-15720960;visibility:visible;mso-wrap-style:square;mso-width-percent:0;mso-height-percent:0;mso-wrap-distance-left:0;mso-wrap-distance-top:0;mso-wrap-distance-right:0;mso-wrap-distance-bottom:0;mso-position-horizontal:absolute;mso-position-horizontal-relative:page;mso-position-vertical:absolute;mso-position-vertical-relative:text;mso-width-percent:0;mso-height-percent:0;mso-width-relative:margin;mso-height-relative:margin;v-text-anchor:top" o:gfxdata="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" filled="f" stroked="f" strokeweight=".6pt">
-                <v:textbox inset="0,0,0,0">
-                  <w:txbxContent>
-                    <w:p>
-                      <w:pPr>
-                        <w:pStyle w:val="ListBullet"/>
-                        <w:numPr>
-                          <w:ilvl w:val="0"/>
-                          <w:numId w:val="0"/>
-                        </w:numPr>
-                        <w:spacing w:after="0" w:line="259" w:lineRule="auto"/>
-                        <w:ind w:left="360" w:hanging="360"/>
-                        <w:jc w:val="center"/>
-                      </w:pPr>
-                      <w:r>
-                        <w:t>Na</w:t>
-                      </w:r>
-                    </w:p>
-                  </w:txbxContent>
-                </v:textbox>
-                <w10:wrap type="topAndBottom" anchorx="page"/>
-              </v:shape>
-            </w:pict>
-          </mc:Fallback>
-        </mc:AlternateContent>
-      </w:r>
       <w:r>
         <w:rPr>
           <w:b/>
@@ -4918,6 +4841,94 @@
           <w:sz w:val="19"/>
         </w:rPr>
         <w:t>REFERENCES</w:t>
+      </w:r>
+    </w:p>
+    <w:p>
+      <w:pPr>
+        <w:ind w:left="305"/>
+        <w:rPr>
+          <w:b/>
+          <w:color w:val="2B99C1"/>
+          <w:spacing w:val="-2"/>
+          <w:sz w:val="19"/>
+        </w:rPr>
+      </w:pPr>
+    </w:p>
+    <w:p>
+      <w:pPr>
+        <w:pStyle w:val="ListBullet"/>
+        <w:numPr>
+          <w:ilvl w:val="0"/>
+          <w:numId w:val="0"/>
+        </w:numPr>
+        <w:spacing w:after="0" w:line="259" w:lineRule="auto"/>
+        <w:ind w:left="360" w:hanging="360"/>
+        <w:rPr>
+          <w:sz w:val="19"/>
+          <w:szCs w:val="19"/>
+        </w:rPr>
+      </w:pPr>
+      <w:r>
+        <w:t xml:space="preserve">      </w:t>
+      </w:r>
+      <w:r>
+        <w:rPr>
+          <w:sz w:val="19"/>
+          <w:szCs w:val="19"/>
+        </w:rPr>
+        <w:t>{#</w:t>
+      </w:r>
+      <w:r>
+        <w:rPr>
+          <w:sz w:val="19"/>
+          <w:szCs w:val="19"/>
+        </w:rPr>
+        <w:t>references</w:t>
+      </w:r>
+      <w:r>
+        <w:rPr>
+          <w:sz w:val="19"/>
+          <w:szCs w:val="19"/>
+        </w:rPr>
+        <w:t>}</w:t>
+      </w:r>
+    </w:p>
+    <w:p>
+      <w:pPr>
+        <w:pStyle w:val="ListBullet"/>
+        <w:numPr>
+          <w:ilvl w:val="0"/>
+          <w:numId w:val="0"/>
+        </w:numPr>
+        <w:spacing w:after="0" w:line="259" w:lineRule="auto"/>
+        <w:ind w:left="360" w:hanging="360"/>
+        <w:rPr>
+          <w:sz w:val="19"/>
+          <w:szCs w:val="19"/>
+        </w:rPr>
+      </w:pPr>
+      <w:r>
+        <w:rPr>
+          <w:sz w:val="19"/>
+          <w:szCs w:val="19"/>
+        </w:rPr>
+        <w:t xml:space="preserve">       {text}</w:t>
+      </w:r>
+    </w:p>
+    <w:p>
+      <w:pPr>
+        <w:pStyle w:val="BodyText"/>
+        <w:spacing w:before="87" w:line="237" w:lineRule="auto"/>
+        <w:ind w:right="6271"/>
+      </w:pPr>
+      <w:r>
+        <w:t xml:space="preserve">       {/</w:t>
+      </w:r>
+      <w:r>
+        <w:t>references</w:t>
+      </w:r>
+      <w:r>
+        <w:t>}</w:t>
       </w:r>
     </w:p>
     <w:sectPr>
@@ -5360,7 +5371,7 @@
             </wp:anchor>
           </w:drawing>
         </mc:Choice>
-        <mc:Fallback xmlns:pic="http://schemas.openxmlformats.org/drawingml/2006/picture" xmlns:a="http://schemas.openxmlformats.org/drawingml/2006/main" xmlns:ve="http://schemas.openxmlformats.org/markup-compatibility/2006">
+        <mc:Fallback xmlns:ve="http://schemas.openxmlformats.org/markup-compatibility/2006" xmlns:a="http://schemas.openxmlformats.org/drawingml/2006/main" xmlns:pic="http://schemas.openxmlformats.org/drawingml/2006/picture">
           <w:pict>
             <v:rect style="position:absolute;margin-left:33.299999pt;margin-top:738pt;width:545.400022pt;height:.6pt;mso-position-horizontal-relative:page;mso-position-vertical-relative:page;z-index:-15931392" id="docshape12" filled="true" fillcolor="#2b99c1" stroked="false">
               <v:fill type="solid"/>
@@ -5573,7 +5584,7 @@
             </wp:anchor>
           </w:drawing>
         </mc:Choice>
-        <mc:Fallback xmlns:pic="http://schemas.openxmlformats.org/drawingml/2006/picture" xmlns:a="http://schemas.openxmlformats.org/drawingml/2006/main" xmlns:ve="http://schemas.openxmlformats.org/markup-compatibility/2006">
+        <mc:Fallback xmlns:ve="http://schemas.openxmlformats.org/markup-compatibility/2006" xmlns:a="http://schemas.openxmlformats.org/drawingml/2006/main" xmlns:pic="http://schemas.openxmlformats.org/drawingml/2006/picture">
           <w:pict>
             <v:rect style="position:absolute;margin-left:33.299999pt;margin-top:738pt;width:545.400022pt;height:.6pt;mso-position-horizontal-relative:page;mso-position-vertical-relative:page;z-index:-15927296" id="docshape19" filled="true" fillcolor="#2b99c1" stroked="false">
               <v:fill type="solid"/>
@@ -8005,7 +8016,6 @@
   <w:style w:type="character" w:default="1" w:styleId="DefaultParagraphFont">
     <w:name w:val="Default Paragraph Font"/>
     <w:uiPriority w:val="1"/>
-    <w:semiHidden/>
     <w:unhideWhenUsed/>
   </w:style>
   <w:style w:type="table" w:default="1" w:styleId="TableNormal">

</xml_diff>